<commit_message>
Supports Word document formatting
</commit_message>
<xml_diff>
--- a/output/output.docx
+++ b/output/output.docx
@@ -4,7 +4,7 @@
   <w:body>
     <w:p>
       <w:pPr>
-        <w:spacing w:after="463"/>
+        <w:spacing w:after="646" w:line="259" w:lineRule="auto"/>
         <w:ind w:left="0" w:firstLine="0"/>
       </w:pPr>
       <w:r>
@@ -13,140 +13,241 @@
     </w:p>
     <w:p>
       <w:pPr>
-        <w:ind w:left="-5"/>
-      </w:pPr>
-      <w:r>
-        <w:t xml:space="preserve">0123456789／（）［］｛｝＝＋–×÷＜＞：；％ </w:t>
-      </w:r>
-    </w:p>
-    <w:p>
-      <w:pPr>
-        <w:ind w:left="-5"/>
-      </w:pPr>
-      <w:r>
-        <w:t xml:space="preserve">＜全角数字→半角数字＞ </w:t>
-      </w:r>
-    </w:p>
-    <w:p>
-      <w:pPr>
-        <w:ind w:left="-5"/>
-      </w:pPr>
-      <w:r>
-        <w:t xml:space="preserve">0123456789 </w:t>
-      </w:r>
-    </w:p>
-    <w:p>
-      <w:pPr>
-        <w:ind w:left="-5"/>
-      </w:pPr>
-      <w:r>
-        <w:t xml:space="preserve">＜半角スラッシュ→全角スラッシュ＞ </w:t>
-      </w:r>
-    </w:p>
-    <w:p>
-      <w:pPr>
-        <w:ind w:left="-5"/>
-      </w:pPr>
-      <w:r>
-        <w:t xml:space="preserve">／ </w:t>
-      </w:r>
-    </w:p>
-    <w:p>
-      <w:pPr>
-        <w:ind w:left="-5"/>
-      </w:pPr>
-      <w:r>
-        <w:t xml:space="preserve">＜半角カッコ→全角カッコ＞ </w:t>
-      </w:r>
-    </w:p>
-    <w:p>
-      <w:pPr>
-        <w:spacing w:after="0" w:line="326" w:lineRule="auto"/>
-        <w:ind w:left="-5" w:right="13258"/>
-      </w:pPr>
-      <w:r>
-        <w:t>（）［］</w:t>
-      </w:r>
-    </w:p>
-    <w:p>
-      <w:pPr>
-        <w:ind w:left="-5"/>
-      </w:pPr>
-      <w:r>
-        <w:t xml:space="preserve">｛｝ </w:t>
-      </w:r>
-    </w:p>
-    <w:p>
-      <w:pPr>
-        <w:ind w:left="-5"/>
-      </w:pPr>
-      <w:r>
-        <w:t xml:space="preserve">＜半角数式記号→全角数式記号＞ </w:t>
-      </w:r>
-    </w:p>
-    <w:p>
-      <w:pPr>
-        <w:ind w:left="-5"/>
-      </w:pPr>
-      <w:r>
-        <w:t xml:space="preserve">＝ </w:t>
-      </w:r>
-    </w:p>
-    <w:p>
-      <w:pPr>
-        <w:ind w:left="-5"/>
-      </w:pPr>
-      <w:r>
-        <w:t xml:space="preserve">– </w:t>
-      </w:r>
-    </w:p>
-    <w:p>
-      <w:pPr>
-        <w:spacing w:after="0" w:line="326" w:lineRule="auto"/>
-        <w:ind w:left="-5" w:right="13197"/>
-      </w:pPr>
-      <w:r>
-        <w:t xml:space="preserve">× ÷ </w:t>
-      </w:r>
-    </w:p>
-    <w:p>
-      <w:pPr>
-        <w:ind w:left="-5"/>
-      </w:pPr>
-      <w:r>
-        <w:t xml:space="preserve">＜＞ </w:t>
-      </w:r>
-    </w:p>
-    <w:p>
-      <w:pPr>
-        <w:spacing w:after="0" w:line="326" w:lineRule="auto"/>
-        <w:ind w:left="-5" w:right="13513"/>
-      </w:pPr>
-      <w:r>
-        <w:t xml:space="preserve">：； </w:t>
-      </w:r>
-    </w:p>
-    <w:p>
-      <w:pPr>
-        <w:ind w:left="-5"/>
-      </w:pPr>
-      <w:r>
-        <w:t xml:space="preserve">％ </w:t>
-      </w:r>
-    </w:p>
-    <w:p>
-      <w:pPr>
-        <w:spacing w:after="0"/>
+        <w:spacing w:after="332"/>
+        <w:ind w:left="-5"/>
+      </w:pPr>
+      <w:r>
+        <w:t>!"#$%&amp;’()*+,–./0123456789:;&lt;=&gt;?@ABCDEFGHIJKLMNOPQRSTUVWXYZa</w:t>
+      </w:r>
+    </w:p>
+    <w:p>
+      <w:pPr>
+        <w:spacing w:after="316"/>
+        <w:ind w:left="-5"/>
+      </w:pPr>
+      <w:r>
+        <w:rPr>
+          <w:highlight w:val="yellow"/>
+        </w:rPr>
+        <w:t>bcdefghijkl</w:t>
+      </w:r>
+      <w:r>
+        <w:t xml:space="preserve">mnopqrstuvwxyz()()•••(.)(.) </w:t>
+      </w:r>
+    </w:p>
+    <w:p>
+      <w:pPr>
+        <w:spacing w:after="189"/>
+        <w:ind w:left="-5"/>
+      </w:pPr>
+      <w:r>
+        <w:t xml:space="preserve">&lt;記号 全角→半角&gt; </w:t>
+      </w:r>
+    </w:p>
+    <w:p>
+      <w:pPr>
+        <w:ind w:left="-5"/>
+      </w:pPr>
+      <w:r>
+        <w:t xml:space="preserve">!"#$%&amp;’()*+,–./ </w:t>
+      </w:r>
+    </w:p>
+    <w:p>
+      <w:pPr>
+        <w:ind w:left="-5"/>
+      </w:pPr>
+      <w:r>
+        <w:t xml:space="preserve">&lt;数字 全角→半角&gt; </w:t>
+      </w:r>
+    </w:p>
+    <w:p>
+      <w:pPr>
+        <w:ind w:left="-5"/>
+      </w:pPr>
+      <w:r>
+        <w:rPr>
+          <w:color w:val="FF0000"/>
+        </w:rPr>
+        <w:t>01234</w:t>
+      </w:r>
+      <w:r>
+        <w:t xml:space="preserve">56789 </w:t>
+      </w:r>
+    </w:p>
+    <w:p>
+      <w:pPr>
+        <w:ind w:left="-5"/>
+      </w:pPr>
+      <w:r>
+        <w:t xml:space="preserve">&lt;数式記号 全角→半角&gt; </w:t>
+      </w:r>
+    </w:p>
+    <w:p>
+      <w:pPr>
+        <w:ind w:left="-5"/>
+      </w:pPr>
+      <w:r>
+        <w:t xml:space="preserve">:;&lt;=&gt;?@ </w:t>
+      </w:r>
+    </w:p>
+    <w:p>
+      <w:pPr>
+        <w:ind w:left="-5"/>
+      </w:pPr>
+      <w:r>
+        <w:t xml:space="preserve">&lt;アルファベット大文字 全角→半角&gt; </w:t>
+      </w:r>
+    </w:p>
+    <w:p>
+      <w:pPr>
+        <w:spacing w:after="810"/>
+        <w:ind w:left="-5"/>
+      </w:pPr>
+      <w:r>
+        <w:t>ABCDEFGHIJKLMN</w:t>
+      </w:r>
+      <w:r>
+        <w:rPr>
+          <w:highlight w:val="cyan"/>
+        </w:rPr>
+        <w:t>OPQRSTUVWXYZ</w:t>
+      </w:r>
+      <w:r>
+        <w:t xml:space="preserve"> </w:t>
+      </w:r>
+    </w:p>
+    <w:p>
+      <w:pPr>
+        <w:spacing w:after="0" w:line="259" w:lineRule="auto"/>
         <w:ind w:left="0" w:firstLine="0"/>
       </w:pPr>
       <w:r>
         <w:t xml:space="preserve"> </w:t>
+      </w:r>
+    </w:p>
+    <w:p>
+      <w:pPr>
+        <w:spacing w:after="646" w:line="259" w:lineRule="auto"/>
+        <w:ind w:left="0" w:firstLine="0"/>
+      </w:pPr>
+      <w:r>
+        <w:t xml:space="preserve"> </w:t>
+      </w:r>
+    </w:p>
+    <w:p>
+      <w:pPr>
+        <w:ind w:left="-5"/>
+      </w:pPr>
+      <w:r>
+        <w:t xml:space="preserve">&lt;アルファベット小文字 全角→半角&gt; </w:t>
+      </w:r>
+    </w:p>
+    <w:p>
+      <w:pPr>
+        <w:ind w:left="-5"/>
+      </w:pPr>
+      <w:r>
+        <w:t>abcdefghijkl</w:t>
+      </w:r>
+      <w:r>
+        <w:rPr>
+          <w:color w:val="00B050"/>
+        </w:rPr>
+        <w:t>mnopqrstuvwxyz</w:t>
+      </w:r>
+      <w:r>
+        <w:t xml:space="preserve"> </w:t>
+      </w:r>
+    </w:p>
+    <w:p>
+      <w:pPr>
+        <w:ind w:left="-5"/>
+      </w:pPr>
+      <w:r>
+        <w:t xml:space="preserve">&lt;全角空白 全角→半角&gt; </w:t>
+      </w:r>
+    </w:p>
+    <w:p>
+      <w:pPr>
+        <w:ind w:left="-5"/>
+      </w:pPr>
+      <w:r>
+        <w:t xml:space="preserve">() </w:t>
+      </w:r>
+    </w:p>
+    <w:p>
+      <w:pPr>
+        <w:ind w:left="-5"/>
+      </w:pPr>
+      <w:r>
+        <w:t xml:space="preserve">&lt;中黒→ビュレット&gt; </w:t>
+      </w:r>
+    </w:p>
+    <w:p>
+      <w:pPr>
+        <w:ind w:left="-5"/>
+      </w:pPr>
+      <w:r>
+        <w:t xml:space="preserve">•••  </w:t>
+      </w:r>
+    </w:p>
+    <w:p>
+      <w:pPr>
+        <w:ind w:left="-5"/>
+      </w:pPr>
+      <w:r>
+        <w:t xml:space="preserve">&lt;文末の半角空白→削除&gt; </w:t>
+      </w:r>
+    </w:p>
+    <w:p>
+      <w:pPr>
+        <w:ind w:left="-5"/>
+      </w:pPr>
+      <w:r>
+        <w:t>(文末空白2文字)social responsibilities.</w:t>
+      </w:r>
+    </w:p>
+    <w:p>
+      <w:pPr>
+        <w:ind w:left="-5"/>
+      </w:pPr>
+      <w:r>
+        <w:t>(文末空白1文字)social responsibilities.</w:t>
+      </w:r>
+    </w:p>
+    <w:p>
+      <w:pPr>
+        <w:ind w:left="-5"/>
+      </w:pPr>
+    </w:p>
+    <w:p>
+      <w:pPr>
+        <w:ind w:left="-5"/>
+      </w:pPr>
+      <w:r>
+        <w:t>(文末空白なし)social responsibilities.</w:t>
+      </w:r>
+    </w:p>
+    <w:p>
+      <w:pPr>
+        <w:ind w:left="-5"/>
+        <w:rPr>
+          <w:rFonts w:hint="eastAsia"/>
+        </w:rPr>
+      </w:pPr>
+      <w:r>
+        <w:rPr>
+          <w:rFonts w:hint="eastAsia"/>
+        </w:rPr>
+        <w:t xml:space="preserve">CO₂ O₂ m2 </w:t>
       </w:r>
     </w:p>
     <w:sectPr>
       <w:pgSz w:w="16838" w:h="11906" w:orient="landscape"/>
-      <w:pgMar w:top="1440" w:right="1440" w:bottom="1440" w:left="1702" w:header="720" w:footer="720" w:gutter="0"/>
+      <w:pgMar w:top="919" w:right="2158" w:bottom="1222" w:left="1702" w:header="0" w:footer="0" w:gutter="0"/>
       <w:cols w:space="720"/>
+      <w:formProt w:val="0"/>
+      <w:docGrid w:linePitch="100"/>
     </w:sectPr>
   </w:body>
 </w:document>
@@ -165,7 +266,11 @@
         <w14:ligatures w14:val="standardContextual"/>
       </w:rPr>
     </w:rPrDefault>
-    <w:pPrDefault/>
+    <w:pPrDefault>
+      <w:pPr>
+        <w:suppressAutoHyphens/>
+      </w:pPr>
+    </w:pPrDefault>
   </w:docDefaults>
   <w:latentStyles w:defLockedState="0" w:defUIPriority="99" w:defSemiHidden="0" w:defUnhideWhenUsed="0" w:defQFormat="0" w:count="376">
     <w:lsdException w:name="Normal" w:uiPriority="0" w:qFormat="1"/>
@@ -549,7 +654,7 @@
     <w:name w:val="Normal"/>
     <w:qFormat/>
     <w:pPr>
-      <w:spacing w:after="98" w:line="259" w:lineRule="auto"/>
+      <w:spacing w:after="492" w:line="264" w:lineRule="auto"/>
       <w:ind w:left="10" w:hanging="10"/>
     </w:pPr>
     <w:rPr>
@@ -585,6 +690,68 @@
     <w:semiHidden/>
     <w:unhideWhenUsed/>
   </w:style>
+  <w:style w:type="paragraph" w:customStyle="1" w:styleId="a3">
+    <w:name w:val="見出し"/>
+    <w:basedOn w:val="a"/>
+    <w:next w:val="a4"/>
+    <w:qFormat/>
+    <w:pPr>
+      <w:keepNext/>
+      <w:spacing w:before="240" w:after="120"/>
+    </w:pPr>
+    <w:rPr>
+      <w:rFonts w:ascii="Liberation Sans" w:eastAsia="Noto Sans JP" w:hAnsi="Liberation Sans" w:cs="Arial"/>
+      <w:sz w:val="28"/>
+      <w:szCs w:val="28"/>
+    </w:rPr>
+  </w:style>
+  <w:style w:type="paragraph" w:styleId="a4">
+    <w:name w:val="Body Text"/>
+    <w:basedOn w:val="a"/>
+    <w:pPr>
+      <w:spacing w:after="140" w:line="276" w:lineRule="auto"/>
+    </w:pPr>
+  </w:style>
+  <w:style w:type="paragraph" w:styleId="a5">
+    <w:name w:val="List"/>
+    <w:basedOn w:val="a4"/>
+    <w:rPr>
+      <w:rFonts w:cs="Arial"/>
+    </w:rPr>
+  </w:style>
+  <w:style w:type="paragraph" w:styleId="a6">
+    <w:name w:val="caption"/>
+    <w:basedOn w:val="a"/>
+    <w:qFormat/>
+    <w:pPr>
+      <w:suppressLineNumbers/>
+      <w:spacing w:before="120" w:after="120"/>
+    </w:pPr>
+    <w:rPr>
+      <w:rFonts w:cs="Arial"/>
+      <w:i/>
+      <w:iCs/>
+      <w:sz w:val="24"/>
+    </w:rPr>
+  </w:style>
+  <w:style w:type="paragraph" w:customStyle="1" w:styleId="a7">
+    <w:name w:val="索引"/>
+    <w:basedOn w:val="a"/>
+    <w:qFormat/>
+    <w:pPr>
+      <w:suppressLineNumbers/>
+    </w:pPr>
+    <w:rPr>
+      <w:rFonts w:cs="Arial"/>
+    </w:rPr>
+  </w:style>
+  <w:style w:type="numbering" w:customStyle="1" w:styleId="a8">
+    <w:name w:val="記号なし"/>
+    <w:uiPriority w:val="99"/>
+    <w:semiHidden/>
+    <w:unhideWhenUsed/>
+    <w:qFormat/>
+  </w:style>
 </w:styles>
 </file>
 
@@ -593,10 +760,10 @@
   <a:themeElements>
     <a:clrScheme name="Office">
       <a:dk1>
-        <a:sysClr val="windowText" lastClr="000000"/>
+        <a:srgbClr val="000000"/>
       </a:dk1>
       <a:lt1>
-        <a:sysClr val="window" lastClr="FFFFFF"/>
+        <a:srgbClr val="FFFFFF"/>
       </a:lt1>
       <a:dk2>
         <a:srgbClr val="0E2841"/>
@@ -634,150 +801,52 @@
         <a:latin typeface="游ゴシック Light" panose="02110004020202020204"/>
         <a:ea typeface=""/>
         <a:cs typeface=""/>
-        <a:font script="Jpan" typeface="游ゴシック Light"/>
-        <a:font script="Hang" typeface="맑은 고딕"/>
-        <a:font script="Hans" typeface="等线 Light"/>
-        <a:font script="Hant" typeface="新細明體"/>
-        <a:font script="Arab" typeface="Times New Roman"/>
-        <a:font script="Hebr" typeface="Times New Roman"/>
-        <a:font script="Thai" typeface="Angsana New"/>
-        <a:font script="Ethi" typeface="Nyala"/>
-        <a:font script="Beng" typeface="Vrinda"/>
-        <a:font script="Gujr" typeface="Shruti"/>
-        <a:font script="Khmr" typeface="MoolBoran"/>
-        <a:font script="Knda" typeface="Tunga"/>
-        <a:font script="Guru" typeface="Raavi"/>
-        <a:font script="Cans" typeface="Euphemia"/>
-        <a:font script="Cher" typeface="Plantagenet Cherokee"/>
-        <a:font script="Yiii" typeface="Microsoft Yi Baiti"/>
-        <a:font script="Tibt" typeface="Microsoft Himalaya"/>
-        <a:font script="Thaa" typeface="MV Boli"/>
-        <a:font script="Deva" typeface="Mangal"/>
-        <a:font script="Telu" typeface="Gautami"/>
-        <a:font script="Taml" typeface="Latha"/>
-        <a:font script="Syrc" typeface="Estrangelo Edessa"/>
-        <a:font script="Orya" typeface="Kalinga"/>
-        <a:font script="Mlym" typeface="Kartika"/>
-        <a:font script="Laoo" typeface="DokChampa"/>
-        <a:font script="Sinh" typeface="Iskoola Pota"/>
-        <a:font script="Mong" typeface="Mongolian Baiti"/>
-        <a:font script="Viet" typeface="Times New Roman"/>
-        <a:font script="Uigh" typeface="Microsoft Uighur"/>
-        <a:font script="Geor" typeface="Sylfaen"/>
-        <a:font script="Armn" typeface="Arial"/>
-        <a:font script="Bugi" typeface="Leelawadee UI"/>
-        <a:font script="Bopo" typeface="Microsoft JhengHei"/>
-        <a:font script="Java" typeface="Javanese Text"/>
-        <a:font script="Lisu" typeface="Segoe UI"/>
-        <a:font script="Mymr" typeface="Myanmar Text"/>
-        <a:font script="Nkoo" typeface="Ebrima"/>
-        <a:font script="Olck" typeface="Nirmala UI"/>
-        <a:font script="Osma" typeface="Ebrima"/>
-        <a:font script="Phag" typeface="Phagspa"/>
-        <a:font script="Syrn" typeface="Estrangelo Edessa"/>
-        <a:font script="Syrj" typeface="Estrangelo Edessa"/>
-        <a:font script="Syre" typeface="Estrangelo Edessa"/>
-        <a:font script="Sora" typeface="Nirmala UI"/>
-        <a:font script="Tale" typeface="Microsoft Tai Le"/>
-        <a:font script="Talu" typeface="Microsoft New Tai Lue"/>
-        <a:font script="Tfng" typeface="Ebrima"/>
       </a:majorFont>
       <a:minorFont>
         <a:latin typeface="游明朝" panose="02110004020202020204"/>
         <a:ea typeface=""/>
         <a:cs typeface=""/>
-        <a:font script="Jpan" typeface="游明朝"/>
-        <a:font script="Hang" typeface="맑은 고딕"/>
-        <a:font script="Hans" typeface="等线"/>
-        <a:font script="Hant" typeface="新細明體"/>
-        <a:font script="Arab" typeface="Arial"/>
-        <a:font script="Hebr" typeface="Arial"/>
-        <a:font script="Thai" typeface="Cordia New"/>
-        <a:font script="Ethi" typeface="Nyala"/>
-        <a:font script="Beng" typeface="Vrinda"/>
-        <a:font script="Gujr" typeface="Shruti"/>
-        <a:font script="Khmr" typeface="DaunPenh"/>
-        <a:font script="Knda" typeface="Tunga"/>
-        <a:font script="Guru" typeface="Raavi"/>
-        <a:font script="Cans" typeface="Euphemia"/>
-        <a:font script="Cher" typeface="Plantagenet Cherokee"/>
-        <a:font script="Yiii" typeface="Microsoft Yi Baiti"/>
-        <a:font script="Tibt" typeface="Microsoft Himalaya"/>
-        <a:font script="Thaa" typeface="MV Boli"/>
-        <a:font script="Deva" typeface="Mangal"/>
-        <a:font script="Telu" typeface="Gautami"/>
-        <a:font script="Taml" typeface="Latha"/>
-        <a:font script="Syrc" typeface="Estrangelo Edessa"/>
-        <a:font script="Orya" typeface="Kalinga"/>
-        <a:font script="Mlym" typeface="Kartika"/>
-        <a:font script="Laoo" typeface="DokChampa"/>
-        <a:font script="Sinh" typeface="Iskoola Pota"/>
-        <a:font script="Mong" typeface="Mongolian Baiti"/>
-        <a:font script="Viet" typeface="Arial"/>
-        <a:font script="Uigh" typeface="Microsoft Uighur"/>
-        <a:font script="Geor" typeface="Sylfaen"/>
-        <a:font script="Armn" typeface="Arial"/>
-        <a:font script="Bugi" typeface="Leelawadee UI"/>
-        <a:font script="Bopo" typeface="Microsoft JhengHei"/>
-        <a:font script="Java" typeface="Javanese Text"/>
-        <a:font script="Lisu" typeface="Segoe UI"/>
-        <a:font script="Mymr" typeface="Myanmar Text"/>
-        <a:font script="Nkoo" typeface="Ebrima"/>
-        <a:font script="Olck" typeface="Nirmala UI"/>
-        <a:font script="Osma" typeface="Ebrima"/>
-        <a:font script="Phag" typeface="Phagspa"/>
-        <a:font script="Syrn" typeface="Estrangelo Edessa"/>
-        <a:font script="Syrj" typeface="Estrangelo Edessa"/>
-        <a:font script="Syre" typeface="Estrangelo Edessa"/>
-        <a:font script="Sora" typeface="Nirmala UI"/>
-        <a:font script="Tale" typeface="Microsoft Tai Le"/>
-        <a:font script="Talu" typeface="Microsoft New Tai Lue"/>
-        <a:font script="Tfng" typeface="Ebrima"/>
       </a:minorFont>
     </a:fontScheme>
-    <a:fmtScheme name="Office">
+    <a:fmtScheme>
       <a:fillStyleLst>
         <a:solidFill>
           <a:schemeClr val="phClr"/>
         </a:solidFill>
-        <a:gradFill rotWithShape="1">
+        <a:gradFill>
           <a:gsLst>
             <a:gs pos="0">
               <a:schemeClr val="phClr">
                 <a:lumMod val="110000"/>
-                <a:satMod val="105000"/>
                 <a:tint val="67000"/>
               </a:schemeClr>
             </a:gs>
             <a:gs pos="50000">
               <a:schemeClr val="phClr">
                 <a:lumMod val="105000"/>
-                <a:satMod val="103000"/>
                 <a:tint val="73000"/>
               </a:schemeClr>
             </a:gs>
             <a:gs pos="100000">
               <a:schemeClr val="phClr">
                 <a:lumMod val="105000"/>
-                <a:satMod val="109000"/>
                 <a:tint val="81000"/>
               </a:schemeClr>
             </a:gs>
           </a:gsLst>
           <a:lin ang="5400000" scaled="0"/>
+          <a:tileRect/>
         </a:gradFill>
-        <a:gradFill rotWithShape="1">
+        <a:gradFill>
           <a:gsLst>
             <a:gs pos="0">
               <a:schemeClr val="phClr">
-                <a:satMod val="103000"/>
                 <a:lumMod val="102000"/>
                 <a:tint val="94000"/>
               </a:schemeClr>
             </a:gs>
             <a:gs pos="50000">
               <a:schemeClr val="phClr">
-                <a:satMod val="110000"/>
                 <a:lumMod val="100000"/>
                 <a:shade val="100000"/>
               </a:schemeClr>
@@ -785,33 +854,24 @@
             <a:gs pos="100000">
               <a:schemeClr val="phClr">
                 <a:lumMod val="99000"/>
-                <a:satMod val="120000"/>
                 <a:shade val="78000"/>
               </a:schemeClr>
             </a:gs>
           </a:gsLst>
           <a:lin ang="5400000" scaled="0"/>
+          <a:tileRect/>
         </a:gradFill>
       </a:fillStyleLst>
       <a:lnStyleLst>
         <a:ln w="12700" cap="flat" cmpd="sng" algn="ctr">
-          <a:solidFill>
-            <a:schemeClr val="phClr"/>
-          </a:solidFill>
           <a:prstDash val="solid"/>
           <a:miter lim="800000"/>
         </a:ln>
         <a:ln w="19050" cap="flat" cmpd="sng" algn="ctr">
-          <a:solidFill>
-            <a:schemeClr val="phClr"/>
-          </a:solidFill>
           <a:prstDash val="solid"/>
           <a:miter lim="800000"/>
         </a:ln>
         <a:ln w="25400" cap="flat" cmpd="sng" algn="ctr">
-          <a:solidFill>
-            <a:schemeClr val="phClr"/>
-          </a:solidFill>
           <a:prstDash val="solid"/>
           <a:miter lim="800000"/>
         </a:ln>
@@ -824,13 +884,7 @@
           <a:effectLst/>
         </a:effectStyle>
         <a:effectStyle>
-          <a:effectLst>
-            <a:outerShdw blurRad="57150" dist="19050" dir="5400000" algn="ctr" rotWithShape="0">
-              <a:srgbClr val="000000">
-                <a:alpha val="63000"/>
-              </a:srgbClr>
-            </a:outerShdw>
-          </a:effectLst>
+          <a:effectLst/>
         </a:effectStyle>
       </a:effectStyleLst>
       <a:bgFillStyleLst>
@@ -840,15 +894,13 @@
         <a:solidFill>
           <a:schemeClr val="phClr">
             <a:tint val="95000"/>
-            <a:satMod val="170000"/>
           </a:schemeClr>
         </a:solidFill>
-        <a:gradFill rotWithShape="1">
+        <a:gradFill>
           <a:gsLst>
             <a:gs pos="0">
               <a:schemeClr val="phClr">
                 <a:tint val="93000"/>
-                <a:satMod val="150000"/>
                 <a:shade val="98000"/>
                 <a:lumMod val="102000"/>
               </a:schemeClr>
@@ -856,7 +908,6 @@
             <a:gs pos="50000">
               <a:schemeClr val="phClr">
                 <a:tint val="98000"/>
-                <a:satMod val="130000"/>
                 <a:shade val="90000"/>
                 <a:lumMod val="103000"/>
               </a:schemeClr>
@@ -864,41 +915,16 @@
             <a:gs pos="100000">
               <a:schemeClr val="phClr">
                 <a:shade val="63000"/>
-                <a:satMod val="120000"/>
               </a:schemeClr>
             </a:gs>
           </a:gsLst>
           <a:lin ang="5400000" scaled="0"/>
+          <a:tileRect/>
         </a:gradFill>
       </a:bgFillStyleLst>
     </a:fmtScheme>
   </a:themeElements>
-  <a:objectDefaults>
-    <a:lnDef>
-      <a:spPr/>
-      <a:bodyPr/>
-      <a:lstStyle/>
-      <a:style>
-        <a:lnRef idx="2">
-          <a:schemeClr val="accent1"/>
-        </a:lnRef>
-        <a:fillRef idx="0">
-          <a:schemeClr val="accent1"/>
-        </a:fillRef>
-        <a:effectRef idx="1">
-          <a:schemeClr val="accent1"/>
-        </a:effectRef>
-        <a:fontRef idx="minor">
-          <a:schemeClr val="tx1"/>
-        </a:fontRef>
-      </a:style>
-    </a:lnDef>
-  </a:objectDefaults>
+  <a:objectDefaults/>
   <a:extraClrSchemeLst/>
-  <a:extLst>
-    <a:ext uri="{05A4C25C-085E-4340-85A3-A5531E510DB2}">
-      <thm15:themeFamily xmlns:thm15="http://schemas.microsoft.com/office/thememl/2012/main" name="Office Theme" id="{2E142A2C-CD16-42D6-873A-C26D2A0506FA}" vid="{1BDDFF52-6CD6-40A5-AB3C-68EB2F1E4D0A}"/>
-    </a:ext>
-  </a:extLst>
 </a:theme>
 </file>
</xml_diff>